<commit_message>
fix(ci): raised version number for ast crate to auto-publish to unblock downstream tensor crate
Signed-off-by: Marvin Hansen <marvin.hansen@gmail.com>
</commit_message>
<xml_diff>
--- a/docs/LF/slides/LF_2026/DeepCausality Project 2026 Update.docx
+++ b/docs/LF/slides/LF_2026/DeepCausality Project 2026 Update.docx
@@ -46,7 +46,6 @@
       <w:r>
         <w:t>Counterfactual Fluid Dynamics</w:t>
       </w:r>
-      <w:r/>
     </w:p>
     <w:p>
       <w:pPr>
@@ -58,18 +57,17 @@
       </w:pPr>
       <w:proofErr w:type="spellStart"/>
       <w:r>
-        <w:t>DeepBrain: Dynamic knowledge representation as the sibling of dynamic causality</w:t>
+        <w:t>DeepBrain</w:t>
       </w:r>
       <w:proofErr w:type="spellEnd"/>
-      <w:r/>
-      <w:r/>
+      <w:r>
+        <w:t>: Dynamic knowledge representation as the sibling of dynamic causality</w:t>
+      </w:r>
     </w:p>
     <w:p>
       <w:r>
         <w:t>In support of all these areas, the DeepCausality project added:</w:t>
       </w:r>
-      <w:r/>
-      <w:r/>
     </w:p>
     <w:p>
       <w:pPr>
@@ -94,18 +92,6 @@
       <w:r>
         <w:t>Precision as a parameter throughout the unified math, implemented via a custom algebraic type system used across all DeepCausality crates. As a result, all scientific simulations can run at every supported floating-point precision level (f32, f64, Float106) by changing a single type alias. Once Rust lands native f16 and f128 floating-point types, these will be supported as well.</w:t>
       </w:r>
-      <w:proofErr w:type="gramStart"/>
-      <w:r/>
-      <w:proofErr w:type="gramEnd"/>
-      <w:r/>
-      <w:r/>
-      <w:r/>
-      <w:r/>
-      <w:r/>
-      <w:proofErr w:type="gramStart"/>
-      <w:r/>
-      <w:proofErr w:type="gramEnd"/>
-      <w:r/>
     </w:p>
     <w:p>
       <w:pPr>
@@ -159,152 +145,51 @@
       <w:r>
         <w:t>A state-of-the-art BRCD algorithm for causal discovery, first published at ICML 2026, was implemented.</w:t>
       </w:r>
-    </w:p>
-    <w:p>
+      <w:r>
+        <w:t xml:space="preserve"> </w:t>
+      </w:r>
       <w:r>
         <w:t>The BRCD algorithm was wired into the Causal Discovery Language on June 8 (PR #616), with a learn-once, rank-many CPDAG cache. Later in the month it gained parallel evaluation across candidates, opt-in near-linear MAP-config pruning, and a DAG sampling module with a polynomial-time Clique-Picking AMO counter.</w:t>
       </w:r>
-      <w:r/>
-      <w:r/>
-      <w:r/>
-      <w:r/>
-      <w:r/>
-      <w:r/>
-      <w:r/>
-      <w:proofErr w:type="gramStart"/>
-      <w:r/>
-      <w:proofErr w:type="gramEnd"/>
-      <w:r/>
-      <w:r/>
-      <w:r/>
-      <w:r/>
-      <w:r/>
     </w:p>
     <w:p>
       <w:r>
         <w:t>The Causal Arrow generalization (PR #613) generalized the causal monad to an Arrow, introducing Morphism and Endomorphism in the underlying algebra. The CausalFlow DSL landed on June 5, giving the monad’s power without its type-level ceremony.</w:t>
       </w:r>
-      <w:r/>
-      <w:r/>
-      <w:r/>
-      <w:r/>
-      <w:r/>
-      <w:r/>
-      <w:r/>
-      <w:r/>
+    </w:p>
+    <w:p>
+      <w:r>
+        <w:t xml:space="preserve">Automatic differentiation was added as forward-mode autodiff over the dual number type, together with numeric integration operators (Euler, RK4, quadrature). The dual number crate and the subsequent calculus crate were published to crates.io. The fast Fourier transform and its inverse were implemented and published in </w:t>
+      </w:r>
       <w:proofErr w:type="spellStart"/>
-      <w:r/>
+      <w:r>
+        <w:t>deep_causality_fft</w:t>
+      </w:r>
       <w:proofErr w:type="spellEnd"/>
-      <w:r/>
-      <w:r/>
-      <w:r/>
-    </w:p>
-    <w:p>
-      <w:r>
-        <w:t>Automatic differentiation was added as forward-mode autodiff over the dual number type, together with numeric integration operators (Euler, RK4, quadrature). The dual number crate and the subsequent calculus crate were published to crates.io. The fast Fourier transform and its inverse were implemented and published in deep_causality_fft on crates.io.</w:t>
-      </w:r>
-      <w:r/>
-      <w:proofErr w:type="spellStart"/>
-      <w:r/>
-      <w:proofErr w:type="spellEnd"/>
-      <w:r/>
-      <w:r/>
-      <w:r/>
-      <w:r/>
-      <w:proofErr w:type="spellStart"/>
-      <w:r/>
-      <w:proofErr w:type="spellEnd"/>
-      <w:r/>
-      <w:r/>
+      <w:r>
+        <w:t xml:space="preserve"> on crates.io.</w:t>
+      </w:r>
     </w:p>
     <w:p/>
     <w:p>
       <w:r>
         <w:t>Counterfactual fluid dynamics was advanced in 2026 in the following ways:</w:t>
       </w:r>
-      <w:r/>
     </w:p>
     <w:p>
       <w:r>
         <w:t>The combined work on the causal arrow, automatic differentiation, and the FFT, together with the unified math, has led to deep_causality_cfd, a new crate (PR #629, PR #637) dedicated to state-of-the-art fluid dynamics fused with dynamic causality. The prior foundational work in advanced field theory has led to the insight that multi-physics can be coupled through a shared field while preserving the invariance of each physics kernel. A quantized tensor-network stack was added to the existing tensor library.</w:t>
       </w:r>
-      <w:proofErr w:type="spellStart"/>
-      <w:proofErr w:type="gramStart"/>
-      <w:r/>
-      <w:proofErr w:type="spellEnd"/>
-      <w:proofErr w:type="gramEnd"/>
-      <w:r/>
-      <w:proofErr w:type="spellStart"/>
-      <w:r/>
-      <w:proofErr w:type="spellEnd"/>
-      <w:r/>
-      <w:r/>
-      <w:r/>
-      <w:r/>
-      <w:r/>
-      <w:r/>
-      <w:proofErr w:type="spellStart"/>
-      <w:r/>
-      <w:proofErr w:type="spellEnd"/>
-      <w:r/>
-      <w:proofErr w:type="spellStart"/>
-      <w:proofErr w:type="gramStart"/>
-      <w:r/>
-      <w:proofErr w:type="spellEnd"/>
-      <w:proofErr w:type="gramEnd"/>
-      <w:r/>
-      <w:proofErr w:type="spellStart"/>
-      <w:r/>
-      <w:proofErr w:type="spellEnd"/>
-      <w:r/>
-      <w:r/>
-      <w:r/>
-      <w:r/>
-      <w:r/>
     </w:p>
     <w:p>
       <w:r>
         <w:t>A QTT solver was added to the CFD project in June. It comprises a quantized-tensor-train bridge (codec, finite-difference operators, linear rollout), a 2-D incompressible Navier-Stokes solver, an immersed body with surface observables, and the Tier-B compressible marcher with 3-D operators and a MetricProvider seam that makes body fitting data rather than a code path.</w:t>
       </w:r>
-      <w:r/>
-      <w:r/>
-      <w:r/>
-      <w:proofErr w:type="gramStart"/>
-      <w:r/>
-      <w:r/>
-      <w:proofErr w:type="gramEnd"/>
-      <w:r/>
-      <w:proofErr w:type="spellStart"/>
-      <w:r/>
-      <w:proofErr w:type="spellEnd"/>
-      <w:r/>
-      <w:r/>
     </w:p>
     <w:p>
       <w:r>
         <w:t>Counterfactual fluid dynamics was then illustrated with a retropropulsion code example that demonstrates the orbital re-entry of a space rocket in reverse: gliding through a plasma blackout, transitioning through multiple governing regimes (supersonic, transonic, subsonic, GNSS denied, GNSS available), and simulating counterfactuals to optimize its retropropulsion booster ignition for a precision landing.</w:t>
       </w:r>
-      <w:r/>
-      <w:proofErr w:type="spellStart"/>
-      <w:r/>
-      <w:proofErr w:type="spellEnd"/>
-      <w:r/>
-      <w:proofErr w:type="spellStart"/>
-      <w:r/>
-      <w:proofErr w:type="spellEnd"/>
-      <w:r/>
-      <w:proofErr w:type="spellStart"/>
-      <w:r/>
-      <w:proofErr w:type="spellEnd"/>
-      <w:r/>
-      <w:proofErr w:type="spellStart"/>
-      <w:r/>
-      <w:proofErr w:type="spellEnd"/>
-      <w:r/>
-      <w:proofErr w:type="spellStart"/>
-      <w:r/>
-      <w:proofErr w:type="spellEnd"/>
-      <w:r/>
     </w:p>
     <w:p/>
     <w:p/>
@@ -317,105 +202,32 @@
       <w:r>
         <w:t>Quantum causal models were initially not planned for 2026. However, the PhD thesis and related publications of Robin Lorenz (Oxford, 2020) were discovered by accident, and his formal method of using monads for quantum causal models proved nearly identical to the use of arity-5 monads in DeepCausality for causal composition. The Dynamic Quantum Causality project was therefore initiated ad hoc in July 2026.</w:t>
       </w:r>
-      <w:r>
+    </w:p>
+    <w:p>
+      <w:pPr>
         <w:rPr>
           <w:rFonts w:ascii="Noto Sans" w:hAnsi="Noto Sans" w:cs="Noto Sans"/>
         </w:rPr>
-      </w:r>
-      <w:r>
-        <w:rPr>
-          <w:rFonts w:ascii="Noto Sans" w:hAnsi="Noto Sans" w:cs="Noto Sans"/>
-        </w:rPr>
-      </w:r>
-      <w:r>
-        <w:rPr>
-          <w:rFonts w:ascii="Noto Sans" w:hAnsi="Noto Sans" w:cs="Noto Sans"/>
-        </w:rPr>
-      </w:r>
-      <w:r>
-        <w:rPr>
-          <w:rFonts w:ascii="Noto Sans" w:hAnsi="Noto Sans" w:cs="Noto Sans"/>
-        </w:rPr>
-      </w:r>
-      <w:r>
-        <w:rPr>
-          <w:rFonts w:ascii="Noto Sans" w:hAnsi="Noto Sans" w:cs="Noto Sans"/>
-        </w:rPr>
-      </w:r>
-      <w:r>
-        <w:rPr>
-          <w:rFonts w:ascii="Noto Sans" w:hAnsi="Noto Sans" w:cs="Noto Sans"/>
-        </w:rPr>
-      </w:r>
-    </w:p>
-    <w:p>
-      <w:pPr>
-        <w:rPr>
-          <w:rFonts w:ascii="Noto Sans" w:hAnsi="Noto Sans" w:cs="Noto Sans"/>
-        </w:rPr>
       </w:pPr>
       <w:r>
         <w:t>The Dynamic Quantum Causality project has already implemented the core of Lorenz causal models embedded in the effect propagation process, has implemented the Haruna gates (Haruna, Osaka, 2025), and is now exploring a novel bridge between quantum causal models and dynamic error codes via the Haruna gates. This became possible because the Haruna formalism is rooted in lattice gauge field theory, which was implemented earlier this year in the geometric algebra crate in anticipation of its use in advanced science. Originally, the idea was to explore dynamic causal structures in condensed matter physics, but quantum causal models were such an obvious fit that the new project was warranted.</w:t>
       </w:r>
-      <w:r>
+    </w:p>
+    <w:p>
+      <w:pPr>
         <w:rPr>
           <w:b/>
           <w:bCs/>
         </w:rPr>
-      </w:r>
-      <w:r>
-        <w:rPr>
-          <w:rFonts w:ascii="Noto Sans" w:hAnsi="Noto Sans" w:cs="Noto Sans"/>
-        </w:rPr>
-      </w:r>
-      <w:r>
-        <w:rPr>
-          <w:rFonts w:ascii="Noto Sans" w:hAnsi="Noto Sans" w:cs="Noto Sans"/>
-        </w:rPr>
-      </w:r>
+      </w:pPr>
+    </w:p>
+    <w:p>
       <w:proofErr w:type="spellStart"/>
       <w:r>
-        <w:rPr>
-          <w:rFonts w:ascii="Noto Sans" w:hAnsi="Noto Sans" w:cs="Noto Sans"/>
-        </w:rPr>
+        <w:t>DeepBrain</w:t>
       </w:r>
       <w:proofErr w:type="spellEnd"/>
       <w:r>
-        <w:rPr>
-          <w:rFonts w:ascii="Noto Sans" w:hAnsi="Noto Sans" w:cs="Noto Sans"/>
-        </w:rPr>
-      </w:r>
-      <w:r>
-        <w:rPr>
-          <w:rFonts w:ascii="Noto Sans" w:hAnsi="Noto Sans" w:cs="Noto Sans"/>
-        </w:rPr>
-      </w:r>
-      <w:r>
-        <w:rPr>
-          <w:rFonts w:ascii="Noto Sans" w:hAnsi="Noto Sans" w:cs="Noto Sans"/>
-        </w:rPr>
-      </w:r>
-      <w:r>
-        <w:rPr>
-          <w:rFonts w:ascii="Noto Sans" w:hAnsi="Noto Sans" w:cs="Noto Sans"/>
-        </w:rPr>
-      </w:r>
-    </w:p>
-    <w:p>
-      <w:pPr>
-        <w:rPr>
-          <w:b/>
-          <w:bCs/>
-        </w:rPr>
-      </w:pPr>
-    </w:p>
-    <w:p>
-      <w:proofErr w:type="spellStart"/>
-      <w:r>
-        <w:t>DeepBrain</w:t>
-      </w:r>
-      <w:proofErr w:type="spellEnd"/>
-      <w:r>
         <w:t>: Dynamic knowledge representation</w:t>
       </w:r>
     </w:p>
@@ -423,19 +235,6 @@
       <w:r>
         <w:t>Originally, the DeepBrain project was designed to address the ongoing documentation challenge of the DeepCausality project. Unlike other projects in the field, the DeepCausality project carries a very high degree of deeply integrated cross-domain knowledge. This becomes apparent when looking at the type system used across the uniform math. Unlike conventional mathematical libraries, the DeepCausality project does not lean on the default type system provided by the Rust programming language. Instead, the correct algebraic abstractions are modeled by hand, and mathematical operations are typed against the corresponding algebraic categories, such as domains, semirings, fields, or complex fields. As a result, something as simple as a linear algebra library suddenly touches on applied category theory, abstract algebra, linear algebra, and type theory.</w:t>
       </w:r>
-      <w:r/>
-      <w:proofErr w:type="gramStart"/>
-      <w:r/>
-      <w:proofErr w:type="gramEnd"/>
-      <w:r/>
-      <w:proofErr w:type="gramStart"/>
-      <w:r/>
-      <w:proofErr w:type="gramEnd"/>
-      <w:r/>
-      <w:proofErr w:type="gramStart"/>
-      <w:r/>
-      <w:proofErr w:type="gramEnd"/>
-      <w:r/>
     </w:p>
     <w:p>
       <w:r>
@@ -446,55 +245,22 @@
       <w:r>
         <w:t>This provenance is critical for refactoring, because any modification of the underlying algebraic type system directly affects one third of the published crates, and implicitly at least three quarters, if not more. The unified math is the fabric that holds the entire project together, and beneath it lies its algebraic foundation. Precise tracing from idea to specification to implementation and downstream usage is therefore paramount to a gradual transition to non-breaking refactoring. The DeepBrain project was specifically designed around this use case, with the foundational idea that this lineage evolves continuously and that the underlying knowledge graph therefore needs to be capable of representing the dynamic evolution of that lineage.</w:t>
       </w:r>
-      <w:proofErr w:type="gramStart"/>
-      <w:r/>
-      <w:proofErr w:type="gramEnd"/>
-      <w:r/>
-      <w:proofErr w:type="spellStart"/>
-      <w:proofErr w:type="gramStart"/>
-      <w:r/>
-      <w:proofErr w:type="spellEnd"/>
-      <w:proofErr w:type="gramEnd"/>
-      <w:r/>
-      <w:proofErr w:type="spellStart"/>
-      <w:r/>
-      <w:proofErr w:type="spellEnd"/>
-      <w:r/>
     </w:p>
     <w:p>
       <w:r>
         <w:t>The DeepBrain project was temporarily deprioritized in favor of the emerging Quantum Causal project.</w:t>
       </w:r>
-      <w:proofErr w:type="spellStart"/>
-      <w:r/>
-      <w:proofErr w:type="spellEnd"/>
-      <w:r/>
-      <w:r/>
     </w:p>
     <w:p>
       <w:r>
         <w:t>However, because of the ongoing integration of DeepCausality into the Service Radar project, renewed interest in the DeepBrain project came from the Service Radar team. Specifically, there was a very explicit need for dynamic ontologies as part of their unified networking information system. An internal feasibility study was commenced and deemed the project feasible with a slightly reduced scope, but DeepBrain has not yet commenced.</w:t>
       </w:r>
-      <w:proofErr w:type="spellStart"/>
-      <w:r/>
-      <w:proofErr w:type="spellEnd"/>
-      <w:r/>
-      <w:r/>
-      <w:r/>
-      <w:r/>
-      <w:r/>
-      <w:proofErr w:type="spellStart"/>
-      <w:r/>
-      <w:proofErr w:type="spellEnd"/>
-      <w:r/>
     </w:p>
     <w:p/>
     <w:p>
       <w:r>
         <w:t>Looking ahead to the rest of the year, the roadmap is clear.</w:t>
       </w:r>
-      <w:r/>
-      <w:r/>
     </w:p>
     <w:p>
       <w:pPr>
@@ -519,7 +285,6 @@
       <w:r>
         <w:t>Advance the Quantum Causal project</w:t>
       </w:r>
-      <w:r/>
     </w:p>
     <w:p>
       <w:pPr>
@@ -564,10 +329,6 @@
       <w:r>
         <w:t>Director, Center for Dynamic Causality</w:t>
       </w:r>
-      <w:proofErr w:type="gramStart"/>
-      <w:r/>
-      <w:proofErr w:type="gramEnd"/>
-      <w:r/>
     </w:p>
     <w:p>
       <w:r>
@@ -587,13 +348,7 @@
     </w:p>
     <w:p>
       <w:r>
-        <w:t xml:space="preserve">Appendix A: A list of all crates </w:t>
-      </w:r>
-      <w:r>
-        <w:t>published</w:t>
-      </w:r>
-      <w:r>
-        <w:t xml:space="preserve"> in 2026</w:t>
+        <w:t>Appendix A: A list of all crates published in 2026</w:t>
       </w:r>
     </w:p>
     <w:p/>
@@ -601,13 +356,6 @@
       <w:r>
         <w:t>The DeepCausality project published a total of 11 new crates in 2026:</w:t>
       </w:r>
-      <w:r/>
-      <w:proofErr w:type="spellStart"/>
-      <w:r/>
-      <w:r/>
-      <w:proofErr w:type="spellEnd"/>
-      <w:r/>
-      <w:r/>
     </w:p>
     <w:p>
       <w:pPr>
@@ -619,14 +367,12 @@
       </w:pPr>
       <w:proofErr w:type="spellStart"/>
       <w:r>
-        <w:t>deep_causality_calculus (Automatic differentiation)</w:t>
+        <w:t>deep_causality_calculus</w:t>
       </w:r>
       <w:proofErr w:type="spellEnd"/>
-      <w:r/>
-      <w:proofErr w:type="spellStart"/>
-      <w:r/>
-      <w:proofErr w:type="spellEnd"/>
-      <w:r/>
+      <w:r>
+        <w:t xml:space="preserve"> (Automatic differentiation)</w:t>
+      </w:r>
     </w:p>
     <w:p>
       <w:pPr>
@@ -638,10 +384,12 @@
       </w:pPr>
       <w:proofErr w:type="spellStart"/>
       <w:r>
-        <w:t>deep_causality_fft (Fast Fourier transform)</w:t>
+        <w:t>deep_causality_fft</w:t>
       </w:r>
       <w:proofErr w:type="spellEnd"/>
-      <w:r/>
+      <w:r>
+        <w:t xml:space="preserve"> (Fast Fourier transform)</w:t>
+      </w:r>
     </w:p>
     <w:p>
       <w:pPr>
@@ -653,10 +401,12 @@
       </w:pPr>
       <w:proofErr w:type="spellStart"/>
       <w:r>
-        <w:t>deep_causality_par (Utilities for multi-core programming)</w:t>
+        <w:t>deep_causality_par</w:t>
       </w:r>
       <w:proofErr w:type="spellEnd"/>
-      <w:r/>
+      <w:r>
+        <w:t xml:space="preserve"> (Utilities for multi-core programming)</w:t>
+      </w:r>
     </w:p>
     <w:p>
       <w:pPr>
@@ -668,10 +418,12 @@
       </w:pPr>
       <w:proofErr w:type="spellStart"/>
       <w:r>
-        <w:t>deep_causality_cfd (Counterfactual fluid dynamics)</w:t>
+        <w:t>deep_causality_cfd</w:t>
       </w:r>
       <w:proofErr w:type="spellEnd"/>
-      <w:r/>
+      <w:r>
+        <w:t xml:space="preserve"> (Counterfactual fluid dynamics)</w:t>
+      </w:r>
     </w:p>
     <w:p>
       <w:pPr>
@@ -700,10 +452,12 @@
       </w:pPr>
       <w:proofErr w:type="spellStart"/>
       <w:r>
-        <w:t>deep_causality_algebra (Slimmed-down version of pure algebra)</w:t>
+        <w:t>deep_causality_algebra</w:t>
       </w:r>
       <w:proofErr w:type="spellEnd"/>
-      <w:r/>
+      <w:r>
+        <w:t xml:space="preserve"> (Slimmed-down version of pure algebra)</w:t>
+      </w:r>
     </w:p>
     <w:p>
       <w:pPr>
@@ -715,10 +469,12 @@
       </w:pPr>
       <w:proofErr w:type="spellStart"/>
       <w:r>
-        <w:t>deep_causality_num_complex (All three complex number sets)</w:t>
+        <w:t>deep_causality_num_complex</w:t>
       </w:r>
       <w:proofErr w:type="spellEnd"/>
-      <w:r/>
+      <w:r>
+        <w:t xml:space="preserve"> (All three complex number sets)</w:t>
+      </w:r>
     </w:p>
     <w:p>
       <w:pPr>
@@ -730,15 +486,12 @@
       </w:pPr>
       <w:proofErr w:type="spellStart"/>
       <w:r>
-        <w:t>deep_causality_num_dual (Dual number set for automatic differentiation)</w:t>
+        <w:t>deep_causality_num_dual</w:t>
       </w:r>
       <w:proofErr w:type="spellEnd"/>
-      <w:r/>
-      <w:proofErr w:type="spellStart"/>
-      <w:r/>
-      <w:r/>
-      <w:proofErr w:type="spellEnd"/>
-      <w:r/>
+      <w:r>
+        <w:t xml:space="preserve"> (Dual number set for automatic differentiation)</w:t>
+      </w:r>
     </w:p>
     <w:p>
       <w:pPr>
@@ -750,10 +503,12 @@
       </w:pPr>
       <w:proofErr w:type="spellStart"/>
       <w:r>
-        <w:t>deep_causality_quantum (Quantum causal models and Haruna gates)</w:t>
+        <w:t>deep_causality_quantum</w:t>
       </w:r>
       <w:proofErr w:type="spellEnd"/>
-      <w:r/>
+      <w:r>
+        <w:t xml:space="preserve"> (Quantum causal models and Haruna gates)</w:t>
+      </w:r>
     </w:p>
     <w:p>
       <w:pPr>
@@ -782,10 +537,12 @@
       </w:pPr>
       <w:proofErr w:type="spellStart"/>
       <w:r>
-        <w:t>deep_causality_linear (Linear algebra)</w:t>
+        <w:t>deep_causality_linear</w:t>
       </w:r>
       <w:proofErr w:type="spellEnd"/>
-      <w:r/>
+      <w:r>
+        <w:t xml:space="preserve"> (Linear algebra)</w:t>
+      </w:r>
     </w:p>
     <w:sectPr>
       <w:pgSz w:w="12240" w:h="15840"/>

</xml_diff>

<commit_message>
docs(docs): Updates slides and notes for the TAC meeting.
Signed-off-by: Marvin Hansen <marvin.hansen@gmail.com>
</commit_message>
<xml_diff>
--- a/docs/LF/slides/LF_2026/DeepCausality Project 2026 Update.docx
+++ b/docs/LF/slides/LF_2026/DeepCausality Project 2026 Update.docx
@@ -34,6 +34,24 @@
       <w:r>
         <w:t>Foundational Dynamic Causality</w:t>
       </w:r>
+      <w:r>
+        <w:t xml:space="preserve"> </w:t>
+      </w:r>
+      <w:r>
+        <w:br/>
+        <w:t xml:space="preserve">See </w:t>
+      </w:r>
+      <w:hyperlink r:id="rId5" w:history="1">
+        <w:r>
+          <w:rPr>
+            <w:rStyle w:val="Hyperlink"/>
+          </w:rPr>
+          <w:t>https://www.deepcausality.com/</w:t>
+        </w:r>
+      </w:hyperlink>
+      <w:r>
+        <w:t xml:space="preserve"> </w:t>
+      </w:r>
     </w:p>
     <w:p>
       <w:pPr>
@@ -46,6 +64,21 @@
       <w:r>
         <w:t>Counterfactual Fluid Dynamics</w:t>
       </w:r>
+      <w:r>
+        <w:br/>
+        <w:t xml:space="preserve">See </w:t>
+      </w:r>
+      <w:hyperlink r:id="rId6" w:history="1">
+        <w:r>
+          <w:rPr>
+            <w:rStyle w:val="Hyperlink"/>
+          </w:rPr>
+          <w:t>https://cfd.deepcausality.com</w:t>
+        </w:r>
+      </w:hyperlink>
+      <w:r>
+        <w:t xml:space="preserve"> </w:t>
+      </w:r>
     </w:p>
     <w:p>
       <w:pPr>
@@ -63,6 +96,21 @@
       <w:r>
         <w:t>: Dynamic knowledge representation as the sibling of dynamic causality</w:t>
       </w:r>
+      <w:r>
+        <w:br/>
+        <w:t xml:space="preserve">See </w:t>
+      </w:r>
+      <w:hyperlink r:id="rId7" w:history="1">
+        <w:r>
+          <w:rPr>
+            <w:rStyle w:val="Hyperlink"/>
+          </w:rPr>
+          <w:t>https://www.causalcenter.com/research/dynamic-knowledge/</w:t>
+        </w:r>
+      </w:hyperlink>
+      <w:r>
+        <w:t xml:space="preserve"> </w:t>
+      </w:r>
     </w:p>
     <w:p>
       <w:r>
@@ -130,14 +178,8 @@
       </w:r>
     </w:p>
     <w:p>
-      <w:pPr>
-        <w:ind w:left="360"/>
-      </w:pPr>
-    </w:p>
-    <w:p/>
-    <w:p/>
-    <w:p>
-      <w:r>
+      <w:r>
+        <w:lastRenderedPageBreak/>
         <w:t>Foundational dynamic causality was advanced in 2026 in the following ways:</w:t>
       </w:r>
     </w:p>
@@ -170,7 +212,6 @@
         <w:t xml:space="preserve"> on crates.io.</w:t>
       </w:r>
     </w:p>
-    <w:p/>
     <w:p>
       <w:r>
         <w:t>Counterfactual fluid dynamics was advanced in 2026 in the following ways:</w:t>
@@ -190,9 +231,10 @@
       <w:r>
         <w:t>Counterfactual fluid dynamics was then illustrated with a retropropulsion code example that demonstrates the orbital re-entry of a space rocket in reverse: gliding through a plasma blackout, transitioning through multiple governing regimes (supersonic, transonic, subsonic, GNSS denied, GNSS available), and simulating counterfactuals to optimize its retropropulsion booster ignition for a precision landing.</w:t>
       </w:r>
-    </w:p>
-    <w:p/>
-    <w:p/>
+      <w:r>
+        <w:br/>
+      </w:r>
+    </w:p>
     <w:p>
       <w:pPr>
         <w:rPr>
@@ -200,9 +242,21 @@
         </w:rPr>
       </w:pPr>
       <w:r>
-        <w:t>Quantum causal models were initially not planned for 2026. However, the PhD thesis and related publications of Robin Lorenz (Oxford, 2020) were discovered by accident, and his formal method of using monads for quantum causal models proved nearly identical to the use of arity-5 monads in DeepCausality for causal composition. The Dynamic Quantum Causality project was therefore initiated ad hoc in July 2026.</w:t>
-      </w:r>
-    </w:p>
+        <w:t>The project website:</w:t>
+      </w:r>
+      <w:r>
+        <w:br/>
+      </w:r>
+      <w:hyperlink r:id="rId8" w:history="1">
+        <w:r>
+          <w:rPr>
+            <w:rStyle w:val="Hyperlink"/>
+          </w:rPr>
+          <w:t>https://cfd.deepcausality.com</w:t>
+        </w:r>
+      </w:hyperlink>
+    </w:p>
+    <w:p/>
     <w:p>
       <w:pPr>
         <w:rPr>
@@ -210,7 +264,43 @@
         </w:rPr>
       </w:pPr>
       <w:r>
+        <w:t>Quantum causal models were initially not planned for 2026. However, the PhD thesis and related publications of Robin Lorenz (Oxford, 2020) were discovered by accident, and his formal method of using monads for quantum causal models proved nearly identical to the use of arity-5 monads in DeepCausality for causal composition. The Dynamic Quantum Causality project was therefore initiated ad hoc in July 2026.</w:t>
+      </w:r>
+    </w:p>
+    <w:p>
+      <w:r>
         <w:t>The Dynamic Quantum Causality project has already implemented the core of Lorenz causal models embedded in the effect propagation process, has implemented the Haruna gates (Haruna, Osaka, 2025), and is now exploring a novel bridge between quantum causal models and dynamic error codes via the Haruna gates. This became possible because the Haruna formalism is rooted in lattice gauge field theory, which was implemented earlier this year in the geometric algebra crate in anticipation of its use in advanced science. Originally, the idea was to explore dynamic causal structures in condensed matter physics, but quantum causal models were such an obvious fit that the new project was warranted.</w:t>
+      </w:r>
+    </w:p>
+    <w:p>
+      <w:pPr>
+        <w:rPr>
+          <w:rFonts w:ascii="Noto Sans" w:hAnsi="Noto Sans" w:cs="Noto Sans"/>
+        </w:rPr>
+      </w:pPr>
+      <w:r>
+        <w:t>The proje</w:t>
+      </w:r>
+      <w:r>
+        <w:t>ct website:</w:t>
+      </w:r>
+      <w:r>
+        <w:br/>
+      </w:r>
+      <w:hyperlink r:id="rId9" w:history="1">
+        <w:r>
+          <w:rPr>
+            <w:rStyle w:val="Hyperlink"/>
+            <w:rFonts w:ascii="Noto Sans" w:hAnsi="Noto Sans" w:cs="Noto Sans"/>
+          </w:rPr>
+          <w:t>https://quantum.deepcausality.com</w:t>
+        </w:r>
+      </w:hyperlink>
+      <w:r>
+        <w:rPr>
+          <w:rFonts w:ascii="Noto Sans" w:hAnsi="Noto Sans" w:cs="Noto Sans"/>
+        </w:rPr>
+        <w:t xml:space="preserve"> </w:t>
       </w:r>
     </w:p>
     <w:p>
@@ -243,7 +333,12 @@
     </w:p>
     <w:p>
       <w:r>
-        <w:t>This provenance is critical for refactoring, because any modification of the underlying algebraic type system directly affects one third of the published crates, and implicitly at least three quarters, if not more. The unified math is the fabric that holds the entire project together, and beneath it lies its algebraic foundation. Precise tracing from idea to specification to implementation and downstream usage is therefore paramount to a gradual transition to non-breaking refactoring. The DeepBrain project was specifically designed around this use case, with the foundational idea that this lineage evolves continuously and that the underlying knowledge graph therefore needs to be capable of representing the dynamic evolution of that lineage.</w:t>
+        <w:t>This provenance is critical for refactoring, because any modification of the underlying algebraic type system directly affects one third of the published crates, and implicitly at least three quarters, if not more. The unified math is the fabric that holds the entire project together, and beneath it lies its algebraic foundation.</w:t>
+      </w:r>
+    </w:p>
+    <w:p>
+      <w:r>
+        <w:t xml:space="preserve"> Precise tracing from idea to specification to implementation and downstream usage is therefore paramount to a gradual transition to non-breaking refactoring. The DeepBrain project was specifically designed around this use case, with the foundational idea that this lineage evolves continuously and that the underlying knowledge graph therefore needs to be capable of representing the dynamic evolution of that lineage.</w:t>
       </w:r>
     </w:p>
     <w:p>
@@ -255,6 +350,21 @@
       <w:r>
         <w:t>However, because of the ongoing integration of DeepCausality into the Service Radar project, renewed interest in the DeepBrain project came from the Service Radar team. Specifically, there was a very explicit need for dynamic ontologies as part of their unified networking information system. An internal feasibility study was commenced and deemed the project feasible with a slightly reduced scope, but DeepBrain has not yet commenced.</w:t>
       </w:r>
+    </w:p>
+    <w:p>
+      <w:r>
+        <w:t>The preliminary project website:</w:t>
+      </w:r>
+    </w:p>
+    <w:p>
+      <w:hyperlink r:id="rId10" w:history="1">
+        <w:r>
+          <w:rPr>
+            <w:rStyle w:val="Hyperlink"/>
+          </w:rPr>
+          <w:t>https://www.causalcenter.com/research/dynamic-knowledge/</w:t>
+        </w:r>
+      </w:hyperlink>
     </w:p>
     <w:p/>
     <w:p>
@@ -325,16 +435,6 @@
         <w:t>Marvin Friedrich Lars Hansen</w:t>
       </w:r>
     </w:p>
-    <w:p>
-      <w:r>
-        <w:t>Director, Center for Dynamic Causality</w:t>
-      </w:r>
-    </w:p>
-    <w:p>
-      <w:r>
-        <w:t>Project Lead, DeepCausality Project</w:t>
-      </w:r>
-    </w:p>
     <w:p/>
     <w:p>
       <w:r>
@@ -347,7 +447,17 @@
       </w:r>
     </w:p>
     <w:p>
-      <w:r>
+      <w:pPr>
+        <w:rPr>
+          <w:b/>
+          <w:bCs/>
+        </w:rPr>
+      </w:pPr>
+      <w:r>
+        <w:rPr>
+          <w:b/>
+          <w:bCs/>
+        </w:rPr>
         <w:t>Appendix A: A list of all crates published in 2026</w:t>
       </w:r>
     </w:p>
@@ -2125,6 +2235,29 @@
       <w:spacing w:val="5"/>
     </w:rPr>
   </w:style>
+  <w:style w:type="character" w:styleId="Hyperlink">
+    <w:name w:val="Hyperlink"/>
+    <w:basedOn w:val="DefaultParagraphFont"/>
+    <w:uiPriority w:val="99"/>
+    <w:unhideWhenUsed/>
+    <w:rsid w:val="007D6C1E"/>
+    <w:rPr>
+      <w:color w:val="467886" w:themeColor="hyperlink"/>
+      <w:u w:val="single"/>
+    </w:rPr>
+  </w:style>
+  <w:style w:type="character" w:styleId="UnresolvedMention">
+    <w:name w:val="Unresolved Mention"/>
+    <w:basedOn w:val="DefaultParagraphFont"/>
+    <w:uiPriority w:val="99"/>
+    <w:semiHidden/>
+    <w:unhideWhenUsed/>
+    <w:rsid w:val="007D6C1E"/>
+    <w:rPr>
+      <w:color w:val="605E5C"/>
+      <w:shd w:val="clear" w:color="auto" w:fill="E1DFDD"/>
+    </w:rPr>
+  </w:style>
 </w:styles>
 </file>
 

</xml_diff>